<commit_message>
fix: validacion de saldo de rubros, fecha PDF informes, diferenciacion de rubros en facturar/facturacion, 405 wire:submit.prevent
</commit_message>
<xml_diff>
--- a/public/Formatos/Sistema de Gestión de Pagos.docx
+++ b/public/Formatos/Sistema de Gestión de Pagos.docx
@@ -378,14 +378,7 @@
           <w:b/>
           <w:lang w:val="es-ES"/>
         </w:rPr>
-        <w:t>Contabilidad</w:t>
-      </w:r>
-      <w:r>
-        <w:rPr>
-          <w:b/>
-          <w:lang w:val="es-ES"/>
-        </w:rPr>
-        <w:t>:</w:t>
+        <w:t>Contabilidad:</w:t>
       </w:r>
       <w:r>
         <w:rPr>
@@ -414,14 +407,7 @@
           <w:b/>
           <w:lang w:val="es-ES"/>
         </w:rPr>
-        <w:t>Tesorería</w:t>
-      </w:r>
-      <w:r>
-        <w:rPr>
-          <w:b/>
-          <w:lang w:val="es-ES"/>
-        </w:rPr>
-        <w:t>:</w:t>
+        <w:t>Tesorería:</w:t>
       </w:r>
       <w:r>
         <w:rPr>
@@ -450,14 +436,7 @@
           <w:b/>
           <w:lang w:val="es-ES"/>
         </w:rPr>
-        <w:t>Dirección</w:t>
-      </w:r>
-      <w:r>
-        <w:rPr>
-          <w:b/>
-          <w:lang w:val="es-ES"/>
-        </w:rPr>
-        <w:t>:</w:t>
+        <w:t>Dirección:</w:t>
       </w:r>
       <w:r>
         <w:rPr>
@@ -492,14 +471,7 @@
           <w:b/>
           <w:lang w:val="es-ES"/>
         </w:rPr>
-        <w:t>Auditoría</w:t>
-      </w:r>
-      <w:r>
-        <w:rPr>
-          <w:b/>
-          <w:lang w:val="es-ES"/>
-        </w:rPr>
-        <w:t>:</w:t>
+        <w:t>Auditoría:</w:t>
       </w:r>
       <w:r>
         <w:rPr>
@@ -4035,6 +4007,220 @@
         <w:tab/>
         <w:t>~1:35</w:t>
       </w:r>
+    </w:p>
+    <w:p>
+      <w:pPr>
+        <w:tabs>
+          <w:tab w:val="left" w:pos="2840"/>
+        </w:tabs>
+        <w:rPr>
+          <w:lang w:val="es-ES"/>
+        </w:rPr>
+      </w:pPr>
+    </w:p>
+    <w:p>
+      <w:pPr>
+        <w:tabs>
+          <w:tab w:val="left" w:pos="2840"/>
+        </w:tabs>
+        <w:rPr>
+          <w:lang w:val="es-ES"/>
+        </w:rPr>
+      </w:pPr>
+      <w:r>
+        <w:rPr>
+          <w:lang w:val="es-ES"/>
+        </w:rPr>
+        <w:t>Los estados de factura que maneja la aplicación son:</w:t>
+      </w:r>
+    </w:p>
+    <w:p>
+      <w:pPr>
+        <w:pBdr>
+          <w:top w:val="single" w:sz="4" w:space="1" w:color="auto"/>
+          <w:left w:val="single" w:sz="4" w:space="4" w:color="auto"/>
+          <w:bottom w:val="single" w:sz="4" w:space="1" w:color="auto"/>
+          <w:right w:val="single" w:sz="4" w:space="4" w:color="auto"/>
+          <w:between w:val="single" w:sz="4" w:space="1" w:color="auto"/>
+          <w:bar w:val="single" w:sz="4" w:color="auto"/>
+        </w:pBdr>
+        <w:tabs>
+          <w:tab w:val="left" w:pos="2840"/>
+        </w:tabs>
+        <w:rPr>
+          <w:lang w:val="es-ES"/>
+        </w:rPr>
+      </w:pPr>
+      <w:r>
+        <w:rPr>
+          <w:lang w:val="es-ES"/>
+        </w:rPr>
+        <w:t>Estado</w:t>
+      </w:r>
+      <w:r>
+        <w:rPr>
+          <w:lang w:val="es-ES"/>
+        </w:rPr>
+        <w:tab/>
+        <w:t>Descripción</w:t>
+      </w:r>
+    </w:p>
+    <w:p>
+      <w:pPr>
+        <w:pBdr>
+          <w:top w:val="single" w:sz="4" w:space="1" w:color="auto"/>
+          <w:left w:val="single" w:sz="4" w:space="4" w:color="auto"/>
+          <w:bottom w:val="single" w:sz="4" w:space="1" w:color="auto"/>
+          <w:right w:val="single" w:sz="4" w:space="4" w:color="auto"/>
+          <w:between w:val="single" w:sz="4" w:space="1" w:color="auto"/>
+          <w:bar w:val="single" w:sz="4" w:color="auto"/>
+        </w:pBdr>
+        <w:tabs>
+          <w:tab w:val="left" w:pos="2840"/>
+        </w:tabs>
+        <w:rPr>
+          <w:lang w:val="es-ES"/>
+        </w:rPr>
+      </w:pPr>
+      <w:r>
+        <w:rPr>
+          <w:lang w:val="es-ES"/>
+        </w:rPr>
+        <w:t>borrador</w:t>
+      </w:r>
+      <w:r>
+        <w:rPr>
+          <w:lang w:val="es-ES"/>
+        </w:rPr>
+        <w:tab/>
+        <w:t>Se puede editar</w:t>
+      </w:r>
+    </w:p>
+    <w:p>
+      <w:pPr>
+        <w:pBdr>
+          <w:top w:val="single" w:sz="4" w:space="1" w:color="auto"/>
+          <w:left w:val="single" w:sz="4" w:space="4" w:color="auto"/>
+          <w:bottom w:val="single" w:sz="4" w:space="1" w:color="auto"/>
+          <w:right w:val="single" w:sz="4" w:space="4" w:color="auto"/>
+          <w:between w:val="single" w:sz="4" w:space="1" w:color="auto"/>
+          <w:bar w:val="single" w:sz="4" w:color="auto"/>
+        </w:pBdr>
+        <w:tabs>
+          <w:tab w:val="left" w:pos="2840"/>
+        </w:tabs>
+        <w:rPr>
+          <w:lang w:val="es-ES"/>
+        </w:rPr>
+      </w:pPr>
+      <w:r>
+        <w:rPr>
+          <w:lang w:val="es-ES"/>
+        </w:rPr>
+        <w:t>emitida</w:t>
+      </w:r>
+      <w:r>
+        <w:rPr>
+          <w:lang w:val="es-ES"/>
+        </w:rPr>
+        <w:tab/>
+        <w:t>No se puede editar (solo consultar)</w:t>
+      </w:r>
+    </w:p>
+    <w:p>
+      <w:pPr>
+        <w:pBdr>
+          <w:top w:val="single" w:sz="4" w:space="1" w:color="auto"/>
+          <w:left w:val="single" w:sz="4" w:space="4" w:color="auto"/>
+          <w:bottom w:val="single" w:sz="4" w:space="1" w:color="auto"/>
+          <w:right w:val="single" w:sz="4" w:space="4" w:color="auto"/>
+          <w:between w:val="single" w:sz="4" w:space="1" w:color="auto"/>
+          <w:bar w:val="single" w:sz="4" w:color="auto"/>
+        </w:pBdr>
+        <w:tabs>
+          <w:tab w:val="left" w:pos="2840"/>
+        </w:tabs>
+        <w:rPr>
+          <w:lang w:val="es-ES"/>
+        </w:rPr>
+      </w:pPr>
+      <w:r>
+        <w:rPr>
+          <w:lang w:val="es-ES"/>
+        </w:rPr>
+        <w:t>anulada</w:t>
+      </w:r>
+      <w:r>
+        <w:rPr>
+          <w:lang w:val="es-ES"/>
+        </w:rPr>
+        <w:tab/>
+        <w:t>No se puede editar. Retenciones se conservan para historial</w:t>
+      </w:r>
+    </w:p>
+    <w:p>
+      <w:pPr>
+        <w:pBdr>
+          <w:top w:val="single" w:sz="4" w:space="1" w:color="auto"/>
+          <w:left w:val="single" w:sz="4" w:space="4" w:color="auto"/>
+          <w:bottom w:val="single" w:sz="4" w:space="1" w:color="auto"/>
+          <w:right w:val="single" w:sz="4" w:space="4" w:color="auto"/>
+          <w:between w:val="single" w:sz="4" w:space="1" w:color="auto"/>
+          <w:bar w:val="single" w:sz="4" w:color="auto"/>
+        </w:pBdr>
+        <w:tabs>
+          <w:tab w:val="left" w:pos="2840"/>
+        </w:tabs>
+        <w:rPr>
+          <w:lang w:val="es-ES"/>
+        </w:rPr>
+      </w:pPr>
+    </w:p>
+    <w:p>
+      <w:pPr>
+        <w:tabs>
+          <w:tab w:val="left" w:pos="7692"/>
+        </w:tabs>
+        <w:rPr>
+          <w:lang w:val="es-ES"/>
+        </w:rPr>
+      </w:pPr>
+      <w:r>
+        <w:rPr>
+          <w:lang w:val="es-ES"/>
+        </w:rPr>
+        <w:tab/>
+      </w:r>
+    </w:p>
+    <w:p>
+      <w:pPr>
+        <w:tabs>
+          <w:tab w:val="left" w:pos="7692"/>
+        </w:tabs>
+        <w:rPr>
+          <w:lang w:val="es-ES"/>
+        </w:rPr>
+      </w:pPr>
+    </w:p>
+    <w:p>
+      <w:pPr>
+        <w:tabs>
+          <w:tab w:val="left" w:pos="7692"/>
+        </w:tabs>
+        <w:rPr>
+          <w:lang w:val="es-ES"/>
+        </w:rPr>
+      </w:pPr>
+    </w:p>
+    <w:p>
+      <w:pPr>
+        <w:tabs>
+          <w:tab w:val="left" w:pos="7692"/>
+        </w:tabs>
+        <w:rPr>
+          <w:lang w:val="es-ES"/>
+        </w:rPr>
+      </w:pPr>
       <w:bookmarkStart w:id="0" w:name="_GoBack"/>
       <w:bookmarkEnd w:id="0"/>
     </w:p>

</xml_diff>